<commit_message>
docs: remove watermark from Lab06B report
</commit_message>
<xml_diff>
--- a/Lab06_CSDL_Basic/6B/BaoCao_Lab06B_CSDL_Basic_NguyenHuynhPhuongDong_3124411071.docx
+++ b/Lab06_CSDL_Basic/6B/BaoCao_Lab06B_CSDL_Basic_NguyenHuynhPhuongDong_3124411071.docx
@@ -53,7 +53,7 @@
                     <pic:cNvPicPr/>
                   </pic:nvPicPr>
                   <pic:blipFill>
-                    <a:blip r:embed="rId10"/>
+                    <a:blip r:embed="rId9"/>
                     <a:stretch>
                       <a:fillRect/>
                     </a:stretch>
@@ -264,8 +264,7 @@
     <w:p>
       <w:pPr>
         <w:sectPr>
-          <w:headerReference w:type="default" r:id="rId9"/>
-          <w:footerReference w:type="default" r:id="rId11"/>
+          <w:footerReference w:type="default" r:id="rId10"/>
           <w:pgSz w:w="12240" w:h="15840"/>
           <w:pgMar w:top="792" w:right="1152" w:bottom="1224" w:left="1152" w:header="720" w:footer="360" w:gutter="0"/>
           <w:cols w:space="720"/>
@@ -1829,7 +1828,7 @@
                     <pic:cNvPicPr/>
                   </pic:nvPicPr>
                   <pic:blipFill>
-                    <a:blip r:embed="rId14"/>
+                    <a:blip r:embed="rId13"/>
                     <a:stretch>
                       <a:fillRect/>
                     </a:stretch>
@@ -2947,7 +2946,7 @@
                     <pic:cNvPicPr/>
                   </pic:nvPicPr>
                   <pic:blipFill>
-                    <a:blip r:embed="rId15"/>
+                    <a:blip r:embed="rId14"/>
                     <a:stretch>
                       <a:fillRect/>
                     </a:stretch>
@@ -3053,7 +3052,7 @@
                     <pic:cNvPicPr/>
                   </pic:nvPicPr>
                   <pic:blipFill>
-                    <a:blip r:embed="rId16"/>
+                    <a:blip r:embed="rId15"/>
                     <a:stretch>
                       <a:fillRect/>
                     </a:stretch>
@@ -3332,7 +3331,7 @@
                     <pic:cNvPicPr/>
                   </pic:nvPicPr>
                   <pic:blipFill>
-                    <a:blip r:embed="rId17"/>
+                    <a:blip r:embed="rId16"/>
                     <a:stretch>
                       <a:fillRect/>
                     </a:stretch>
@@ -3589,7 +3588,7 @@
                     <pic:cNvPicPr/>
                   </pic:nvPicPr>
                   <pic:blipFill>
-                    <a:blip r:embed="rId18"/>
+                    <a:blip r:embed="rId17"/>
                     <a:stretch>
                       <a:fillRect/>
                     </a:stretch>
@@ -3848,7 +3847,7 @@
                     <pic:cNvPicPr/>
                   </pic:nvPicPr>
                   <pic:blipFill>
-                    <a:blip r:embed="rId19"/>
+                    <a:blip r:embed="rId18"/>
                     <a:stretch>
                       <a:fillRect/>
                     </a:stretch>
@@ -4119,7 +4118,7 @@
                     <pic:cNvPicPr/>
                   </pic:nvPicPr>
                   <pic:blipFill>
-                    <a:blip r:embed="rId20"/>
+                    <a:blip r:embed="rId19"/>
                     <a:stretch>
                       <a:fillRect/>
                     </a:stretch>
@@ -4396,7 +4395,7 @@
                     <pic:cNvPicPr/>
                   </pic:nvPicPr>
                   <pic:blipFill>
-                    <a:blip r:embed="rId21"/>
+                    <a:blip r:embed="rId20"/>
                     <a:stretch>
                       <a:fillRect/>
                     </a:stretch>
@@ -4684,7 +4683,7 @@
                     <pic:cNvPicPr/>
                   </pic:nvPicPr>
                   <pic:blipFill>
-                    <a:blip r:embed="rId22"/>
+                    <a:blip r:embed="rId21"/>
                     <a:stretch>
                       <a:fillRect/>
                     </a:stretch>
@@ -4740,7 +4739,7 @@
                     <pic:cNvPicPr/>
                   </pic:nvPicPr>
                   <pic:blipFill>
-                    <a:blip r:embed="rId23"/>
+                    <a:blip r:embed="rId22"/>
                     <a:stretch>
                       <a:fillRect/>
                     </a:stretch>
@@ -4796,7 +4795,7 @@
                     <pic:cNvPicPr/>
                   </pic:nvPicPr>
                   <pic:blipFill>
-                    <a:blip r:embed="rId24"/>
+                    <a:blip r:embed="rId23"/>
                     <a:stretch>
                       <a:fillRect/>
                     </a:stretch>
@@ -5826,8 +5825,8 @@
       </w:r>
     </w:p>
     <w:sectPr>
-      <w:headerReference w:type="default" r:id="rId12"/>
-      <w:footerReference w:type="default" r:id="rId13"/>
+      <w:headerReference w:type="default" r:id="rId11"/>
+      <w:footerReference w:type="default" r:id="rId12"/>
       <w:pgSz w:w="12240" w:h="15840"/>
       <w:pgMar w:top="1037" w:right="1181" w:bottom="1037" w:left="1181" w:header="360" w:footer="432" w:gutter="0"/>
       <w:cols w:space="720"/>
@@ -5884,75 +5883,8 @@
   <w:p>
     <w:pPr>
       <w:pStyle w:val="Header"/>
-      <w:jc w:val="center"/>
-    </w:pPr>
-    <w:r>
-      <w:pict>
-        <v:shapetype id="_x0000_t136" coordsize="21600,21600" o:spt="136" adj="10800" path="m@7,l@8,m@5,21600l@6,21600e">
-          <v:formulas>
-            <v:f eqn="sum #0 0 10800"/>
-            <v:f eqn="prod #0 2 1"/>
-            <v:f eqn="sum 21600 0 @1"/>
-            <v:f eqn="sum 0 0 @2"/>
-            <v:f eqn="sum 21600 0 @3"/>
-            <v:f eqn="if @0 @3 0"/>
-            <v:f eqn="if @0 21600 @1"/>
-            <v:f eqn="if @0 0 @2"/>
-            <v:f eqn="if @0 @4 21600"/>
-            <v:f eqn="mid @5 @6"/>
-            <v:f eqn="mid @8 @5"/>
-            <v:f eqn="mid @7 @8"/>
-            <v:f eqn="mid @6 @7"/>
-            <v:f eqn="sum @6 0 @5"/>
-          </v:formulas>
-          <v:path textpathok="t" o:connecttype="custom" o:connectlocs="@9,0;@10,10800;@11,21600;@12,10800" o:connectangles="270,180,90,0"/>
-          <v:textpath on="t" fitshape="t"/>
-          <o:lock v:ext="edit" text="t" shapetype="t"/>
-        </v:shapetype>
-        <v:shape id="PowerPlusWaterMarkObject1" o:spid="_x0000_s2049" type="#_x0000_t136" style="position:absolute;margin-left:0;margin-top:0;width:500pt;height:95pt;rotation:315;z-index:-251654144;mso-position-horizontal:center;mso-position-horizontal-relative:margin;mso-position-vertical:center;mso-position-vertical-relative:margin" fillcolor="#DDEBF7" stroked="f">
-          <v:textpath style="font-family:Arial;font-size:1pt;font-weight:bold" string="NGUYỄN HUỲNH PHƯƠNG ĐÔNG  3124411071"/>
-        </v:shape>
-      </w:pict>
-    </w:r>
-  </w:p>
-</w:hdr>
-</file>
-
-<file path=word/header2.xml><?xml version="1.0" encoding="utf-8"?>
-<w:hdr xmlns:m="http://schemas.openxmlformats.org/officeDocument/2006/math" xmlns:mc="http://schemas.openxmlformats.org/markup-compatibility/2006" xmlns:mo="http://schemas.microsoft.com/office/mac/office/2008/main" xmlns:mv="urn:schemas-microsoft-com:mac:vml" xmlns:o="urn:schemas-microsoft-com:office:office" xmlns:r="http://schemas.openxmlformats.org/officeDocument/2006/relationships" xmlns:v="urn:schemas-microsoft-com:vml" xmlns:w10="urn:schemas-microsoft-com:office:word" xmlns:w14="http://schemas.microsoft.com/office/word/2010/wordml" xmlns:w="http://schemas.openxmlformats.org/wordprocessingml/2006/main" xmlns:wne="http://schemas.microsoft.com/office/word/2006/wordml" xmlns:wp14="http://schemas.microsoft.com/office/word/2010/wordprocessingDrawing" xmlns:wp="http://schemas.openxmlformats.org/drawingml/2006/wordprocessingDrawing" xmlns:wpc="http://schemas.microsoft.com/office/word/2010/wordprocessingCanvas" xmlns:wpg="http://schemas.microsoft.com/office/word/2010/wordprocessingGroup" xmlns:wpi="http://schemas.microsoft.com/office/word/2010/wordprocessingInk" xmlns:wps="http://schemas.microsoft.com/office/word/2010/wordprocessingShape" mc:Ignorable="w14 wp14">
-  <w:p>
-    <w:pPr>
-      <w:pStyle w:val="Header"/>
       <w:jc w:val="right"/>
     </w:pPr>
-    <w:r>
-      <w:pict>
-        <v:shapetype id="_x0000_t136" coordsize="21600,21600" o:spt="136" adj="10800" path="m@7,l@8,m@5,21600l@6,21600e">
-          <v:formulas>
-            <v:f eqn="sum #0 0 10800"/>
-            <v:f eqn="prod #0 2 1"/>
-            <v:f eqn="sum 21600 0 @1"/>
-            <v:f eqn="sum 0 0 @2"/>
-            <v:f eqn="sum 21600 0 @3"/>
-            <v:f eqn="if @0 @3 0"/>
-            <v:f eqn="if @0 21600 @1"/>
-            <v:f eqn="if @0 0 @2"/>
-            <v:f eqn="if @0 @4 21600"/>
-            <v:f eqn="mid @5 @6"/>
-            <v:f eqn="mid @8 @5"/>
-            <v:f eqn="mid @7 @8"/>
-            <v:f eqn="mid @6 @7"/>
-            <v:f eqn="sum @6 0 @5"/>
-          </v:formulas>
-          <v:path textpathok="t" o:connecttype="custom" o:connectlocs="@9,0;@10,10800;@11,21600;@12,10800" o:connectangles="270,180,90,0"/>
-          <v:textpath on="t" fitshape="t"/>
-          <o:lock v:ext="edit" text="t" shapetype="t"/>
-        </v:shapetype>
-        <v:shape id="PowerPlusWaterMarkObject1" o:spid="_x0000_s2049" type="#_x0000_t136" style="position:absolute;margin-left:0;margin-top:0;width:500pt;height:95pt;rotation:315;z-index:-251654144;mso-position-horizontal:center;mso-position-horizontal-relative:margin;mso-position-vertical:center;mso-position-vertical-relative:margin" fillcolor="#DDEBF7" stroked="f">
-          <v:textpath style="font-family:Arial;font-size:1pt;font-weight:bold" string="NGUYỄN HUỲNH PHƯƠNG ĐÔNG  3124411071"/>
-        </v:shape>
-      </w:pict>
-    </w:r>
     <w:r>
       <w:rPr>
         <w:rFonts w:ascii="Times New Roman" w:hAnsi="Times New Roman" w:eastAsia="Times New Roman"/>

</xml_diff>